<commit_message>
ER Diagram as a schema diagram that is easier to read: keys first, the table each foreign key points to inside the table, cardinality as 1 / 0..1 / 1..N / 0..N, the production order group split in two
Co-Authored-By: Claude Sonnet 5.5 <noreply@anthropic.com>
</commit_message>
<xml_diff>
--- a/docs/ProjectdocInfo/ERDiagram/ER Diagram.docx
+++ b/docs/ProjectdocInfo/ERDiagram/ER Diagram.docx
@@ -176,7 +176,7 @@
           <w:sz w:val="18"/>
           <w:szCs w:val="18"/>
         </w:rPr>
-        <w:t xml:space="preserve">Figure 2. Users and files</w:t>
+        <w:t xml:space="preserve">Figure 2. Users and files (1 = exactly one, 0..1 = none or one, 1..N = one or many, 0..N = none, one or many; → = the foreign key points to)</w:t>
       </w:r>
     </w:p>
     <w:p>
@@ -187,7 +187,7 @@
       <w:r>
         <w:drawing>
           <wp:inline distT="0" distB="0" distL="0" distR="0">
-            <wp:extent cx="9391650" cy="2847975"/>
+            <wp:extent cx="9391650" cy="2524125"/>
             <wp:effectExtent t="0" r="0" b="0" l="0"/>
             <wp:docPr id="1" name="" descr="" title=""/>
             <wp:cNvGraphicFramePr>
@@ -218,7 +218,7 @@
                   <pic:spPr bwMode="auto">
                     <a:xfrm>
                       <a:off x="0" y="0"/>
-                      <a:ext cx="9391650" cy="2847975"/>
+                      <a:ext cx="9391650" cy="2524125"/>
                     </a:xfrm>
                     <a:prstGeom prst="rect">
                       <a:avLst/>
@@ -241,7 +241,7 @@
           <w:sz w:val="18"/>
           <w:szCs w:val="18"/>
         </w:rPr>
-        <w:t xml:space="preserve">Figure 3. Master data: products and materials</w:t>
+        <w:t xml:space="preserve">Figure 3. Master data: products and materials (1 = exactly one, 0..1 = none or one, 1..N = one or many, 0..N = none, one or many; → = the foreign key points to)</w:t>
       </w:r>
     </w:p>
     <w:p>
@@ -252,7 +252,7 @@
       <w:r>
         <w:drawing>
           <wp:inline distT="0" distB="0" distL="0" distR="0">
-            <wp:extent cx="4295775" cy="5962650"/>
+            <wp:extent cx="4448175" cy="5962650"/>
             <wp:effectExtent t="0" r="0" b="0" l="0"/>
             <wp:docPr id="1" name="" descr="" title=""/>
             <wp:cNvGraphicFramePr>
@@ -283,7 +283,7 @@
                   <pic:spPr bwMode="auto">
                     <a:xfrm>
                       <a:off x="0" y="0"/>
-                      <a:ext cx="4295775" cy="5962650"/>
+                      <a:ext cx="4448175" cy="5962650"/>
                     </a:xfrm>
                     <a:prstGeom prst="rect">
                       <a:avLst/>
@@ -306,7 +306,7 @@
           <w:sz w:val="18"/>
           <w:szCs w:val="18"/>
         </w:rPr>
-        <w:t xml:space="preserve">Figure 4. Master data: customers and suppliers</w:t>
+        <w:t xml:space="preserve">Figure 4. Master data: customers and suppliers (1 = exactly one, 0..1 = none or one, 1..N = one or many, 0..N = none, one or many; → = the foreign key points to)</w:t>
       </w:r>
     </w:p>
     <w:p>
@@ -317,7 +317,7 @@
       <w:r>
         <w:drawing>
           <wp:inline distT="0" distB="0" distL="0" distR="0">
-            <wp:extent cx="6267450" cy="5048250"/>
+            <wp:extent cx="7124700" cy="5324475"/>
             <wp:effectExtent t="0" r="0" b="0" l="0"/>
             <wp:docPr id="1" name="" descr="" title=""/>
             <wp:cNvGraphicFramePr>
@@ -348,7 +348,7 @@
                   <pic:spPr bwMode="auto">
                     <a:xfrm>
                       <a:off x="0" y="0"/>
-                      <a:ext cx="6267450" cy="5048250"/>
+                      <a:ext cx="7124700" cy="5324475"/>
                     </a:xfrm>
                     <a:prstGeom prst="rect">
                       <a:avLst/>
@@ -371,7 +371,7 @@
           <w:sz w:val="18"/>
           <w:szCs w:val="18"/>
         </w:rPr>
-        <w:t xml:space="preserve">Figure 5. Sale: quotation</w:t>
+        <w:t xml:space="preserve">Figure 5. Sale: quotation (1 = exactly one, 0..1 = none or one, 1..N = one or many, 0..N = none, one or many; → = the foreign key points to)</w:t>
       </w:r>
     </w:p>
     <w:p>
@@ -382,7 +382,7 @@
       <w:r>
         <w:drawing>
           <wp:inline distT="0" distB="0" distL="0" distR="0">
-            <wp:extent cx="6267450" cy="7972425"/>
+            <wp:extent cx="6267450" cy="4924425"/>
             <wp:effectExtent t="0" r="0" b="0" l="0"/>
             <wp:docPr id="1" name="" descr="" title=""/>
             <wp:cNvGraphicFramePr>
@@ -413,7 +413,7 @@
                   <pic:spPr bwMode="auto">
                     <a:xfrm>
                       <a:off x="0" y="0"/>
-                      <a:ext cx="6267450" cy="7972425"/>
+                      <a:ext cx="6267450" cy="4924425"/>
                     </a:xfrm>
                     <a:prstGeom prst="rect">
                       <a:avLst/>
@@ -436,7 +436,7 @@
           <w:sz w:val="18"/>
           <w:szCs w:val="18"/>
         </w:rPr>
-        <w:t xml:space="preserve">Figure 6. Sale: production order</w:t>
+        <w:t xml:space="preserve">Figure 6. Sale: production order and its lines (1 = exactly one, 0..1 = none or one, 1..N = one or many, 0..N = none, one or many; → = the foreign key points to)</w:t>
       </w:r>
     </w:p>
     <w:p>
@@ -447,7 +447,7 @@
       <w:r>
         <w:drawing>
           <wp:inline distT="0" distB="0" distL="0" distR="0">
-            <wp:extent cx="6267450" cy="5410200"/>
+            <wp:extent cx="4486275" cy="5638800"/>
             <wp:effectExtent t="0" r="0" b="0" l="0"/>
             <wp:docPr id="1" name="" descr="" title=""/>
             <wp:cNvGraphicFramePr>
@@ -478,7 +478,7 @@
                   <pic:spPr bwMode="auto">
                     <a:xfrm>
                       <a:off x="0" y="0"/>
-                      <a:ext cx="6267450" cy="5410200"/>
+                      <a:ext cx="4486275" cy="5638800"/>
                     </a:xfrm>
                     <a:prstGeom prst="rect">
                       <a:avLst/>
@@ -501,7 +501,7 @@
           <w:sz w:val="18"/>
           <w:szCs w:val="18"/>
         </w:rPr>
-        <w:t xml:space="preserve">Figure 7. Accounting</w:t>
+        <w:t xml:space="preserve">Figure 7. Sale: processes and progress (1 = exactly one, 0..1 = none or one, 1..N = one or many, 0..N = none, one or many; → = the foreign key points to)</w:t>
       </w:r>
     </w:p>
     <w:p>
@@ -512,7 +512,7 @@
       <w:r>
         <w:drawing>
           <wp:inline distT="0" distB="0" distL="0" distR="0">
-            <wp:extent cx="7734300" cy="5324475"/>
+            <wp:extent cx="8020050" cy="5324475"/>
             <wp:effectExtent t="0" r="0" b="0" l="0"/>
             <wp:docPr id="1" name="" descr="" title=""/>
             <wp:cNvGraphicFramePr>
@@ -543,7 +543,7 @@
                   <pic:spPr bwMode="auto">
                     <a:xfrm>
                       <a:off x="0" y="0"/>
-                      <a:ext cx="7734300" cy="5324475"/>
+                      <a:ext cx="8020050" cy="5324475"/>
                     </a:xfrm>
                     <a:prstGeom prst="rect">
                       <a:avLst/>
@@ -566,7 +566,72 @@
           <w:sz w:val="18"/>
           <w:szCs w:val="18"/>
         </w:rPr>
-        <w:t xml:space="preserve">Figure 8. Purchase and stock</w:t>
+        <w:t xml:space="preserve">Figure 8. Accounting (1 = exactly one, 0..1 = none or one, 1..N = one or many, 0..N = none, one or many; → = the foreign key points to)</w:t>
+      </w:r>
+    </w:p>
+    <w:p>
+      <w:pPr>
+        <w:keepNext/>
+        <w:jc w:val="center"/>
+      </w:pPr>
+      <w:r>
+        <w:drawing>
+          <wp:inline distT="0" distB="0" distL="0" distR="0">
+            <wp:extent cx="9382125" cy="5324475"/>
+            <wp:effectExtent t="0" r="0" b="0" l="0"/>
+            <wp:docPr id="1" name="" descr="" title=""/>
+            <wp:cNvGraphicFramePr>
+              <a:graphicFrameLocks xmlns:a="http://schemas.openxmlformats.org/drawingml/2006/main" noChangeAspect="1"/>
+            </wp:cNvGraphicFramePr>
+            <a:graphic xmlns:a="http://schemas.openxmlformats.org/drawingml/2006/main">
+              <a:graphicData uri="http://schemas.openxmlformats.org/drawingml/2006/picture">
+                <pic:pic xmlns:pic="http://schemas.openxmlformats.org/drawingml/2006/picture">
+                  <pic:nvPicPr>
+                    <pic:cNvPr id="0" name="" descr=""/>
+                    <pic:cNvPicPr>
+                      <a:picLocks noChangeAspect="1" noChangeArrowheads="1"/>
+                    </pic:cNvPicPr>
+                  </pic:nvPicPr>
+                  <pic:blipFill>
+                    <a:blip r:embed="rId24" cstate="none">
+                      <a:extLst>
+                        <a:ext uri="{96DAC541-7B7A-43D3-8B79-37D633B846F1}">
+                          <asvg:svgBlip xmlns:asvg="http://schemas.microsoft.com/office/drawing/2016/SVG/main" r:embed="rId23"/>
+                        </a:ext>
+                      </a:extLst>
+                    </a:blip>
+                    <a:srcRect/>
+                    <a:stretch>
+                      <a:fillRect/>
+                    </a:stretch>
+                  </pic:blipFill>
+                  <pic:spPr bwMode="auto">
+                    <a:xfrm>
+                      <a:off x="0" y="0"/>
+                      <a:ext cx="9382125" cy="5324475"/>
+                    </a:xfrm>
+                    <a:prstGeom prst="rect">
+                      <a:avLst/>
+                    </a:prstGeom>
+                  </pic:spPr>
+                </pic:pic>
+              </a:graphicData>
+            </a:graphic>
+          </wp:inline>
+        </w:drawing>
+      </w:r>
+    </w:p>
+    <w:p>
+      <w:pPr>
+        <w:spacing w:after="200"/>
+        <w:jc w:val="center"/>
+      </w:pPr>
+      <w:r>
+        <w:rPr>
+          <w:sz w:val="18"/>
+          <w:szCs w:val="18"/>
+        </w:rPr>
+        <w:t xml:space="preserve">Figure 9. Purchase and stock (1 = exactly one, 0..1 = none or one, 1..N = one or many, 0..N = none, one or many; → = the foreign key points to)</w:t>
       </w:r>
     </w:p>
     <w:p>

</xml_diff>